<commit_message>
Refactor: Penyatuan seluruh kode Python ke main.py dan penambahan fitur simpan ke Google Drive pada Notebook Colab
</commit_message>
<xml_diff>
--- a/Laporan_Lengkap_UTS_DeepLearning_CNN.docx
+++ b/Laporan_Lengkap_UTS_DeepLearning_CNN.docx
@@ -312,12 +312,7 @@
     </w:p>
     <w:p>
       <w:r>
-        <w:t>Kanker paru-paru merupakan penyebab utama mortalitas terkait kanker secara global. Deteksi dini melalui modalitas pencitraan Computed Tomography (CT-Scan) thorax adalah standar utama dalam menilai keberadaan nodul paru. Convolutional Neural Network (CNN) telah terbukti mampu mengekstraksi representasi fitur morfologis jaringan medis dengan akurasi tinggi.</w:t>
-      </w:r>
-    </w:p>
-    <w:p>
-      <w:r>
-        <w:t>Sesuai arahan Dosen Pengampu Dr. Wahyudi Setiawan, S.Kom., M.Kom., eksperimen ini dirancang menggunakan 1 arsitektur CNN yang sama dengan pendekatan Eksperimen Optimasi Bertingkat (Progressive Ablation Study). Pada pendekatan ini, setiap skenario menentukan konfigurasi terbaik dari suatu parameter, yang kemudian langsung diwariskan ke skenario berikutnya untuk pengujian faktor baru hingga diperoleh Model Juara Akhir (Final Champion Model).</w:t>
+        <w:t>Kanker paru-paru merupakan salah satu penyebab mortalitas tertinggi di dunia. Penggunaan modalitas pencitraan Computed Tomography (CT-Scan) thorax adalah standar utama dalam menilai lesi dan nodul jaringan paru. Sesuai arahan Dosen Pengampu Dr. Wahyudi Setiawan, S.Kom., M.Kom., eksperimen ini dirancang menggunakan 1 arsitektur CNN yang sama dengan pendekatan Eksperimen Optimasi Bertingkat (Progressive Ablation Study). Konfigurasi terbaik dari masing-masing skenario diwariskan ke tahap berikutnya untuk pengujian faktor baru hingga diperoleh Final Champion Model.</w:t>
       </w:r>
     </w:p>
     <w:p>
@@ -337,12 +332,7 @@
     </w:p>
     <w:p>
       <w:r>
-        <w:t>Dataset yang digunakan adalah The IQ-OTHNCCD Lung Cancer Dataset yang dipublikasikan secara terbuka di Mendeley Data (DOI: 10.17632/bhmdr45bh2.2) oleh Hamdalla Alyasriy &amp; Muayed AL-Huseiny dari Wasit University, Irak. Data dihimpun dari Iraq-Oncology Teaching Hospital dan National Center for Cancer Diseases. Dataset mencakup 1.097 citra CT-scan 2D dengan distribusi kelas: Benign (120 citra), Malignant (561 citra), dan Normal (416 citra).</w:t>
-      </w:r>
-    </w:p>
-    <w:p>
-      <w:r>
-        <w:t>Setiap citra CT-Scan 512x512 diubah ukurannya menjadi 128x128 piksel dan dinormalisasi intensitasnya ke rentang [0.0, 1.0]. Pembagian dataset dilakukan menggunakan stratified sampling agar proporsi kelas tetap konsisten.</w:t>
+        <w:t>Dataset yang digunakan adalah The IQ-OTHNCCD Lung Cancer Dataset dari Mendeley Data (DOI: 10.17632/bhmdr45bh2.2) karya Hamdalla Alyasriy &amp; Muayed AL-Huseiny. Dataset terdiri dari 1.097 citra CT-Scan 2D yang terbagi menjadi 3 kelas: Benign (120 citra), Malignant (561 citra), dan Normal (416 citra). Citra di-resize ke ukuran 128x128 piksel dan dinormalisasi intensitasnya ke skala [0.0, 1.0].</w:t>
       </w:r>
     </w:p>
     <w:p>
@@ -362,17 +352,17 @@
     </w:p>
     <w:p>
       <w:r>
-        <w:t>Model dirancang dengan 4 blok konvolusi hierarkis (memenuhi syarat minimal 3 blok Conv-ReLU-Pooling):</w:t>
+        <w:t>Model dirancang dengan 4 blok konvolusi hierarkis:</w:t>
         <w:br/>
-        <w:t>• Blok 1: Conv2D(32 filter, 3x3) + ReLU + MaxPooling2D(2x2)</w:t>
+        <w:t>• Blok 1: Conv2D(32, 3x3) + ReLU + MaxPooling2D(2x2)</w:t>
         <w:br/>
-        <w:t>• Blok 2: Conv2D(64 filter, 3x3) + ReLU + MaxPooling2D(2x2)</w:t>
+        <w:t>• Blok 2: Conv2D(64, 3x3) + ReLU + MaxPooling2D(2x2)</w:t>
         <w:br/>
-        <w:t>• Blok 3: Conv2D(128 filter, 3x3) + ReLU + MaxPooling2D(2x2)</w:t>
+        <w:t>• Blok 3: Conv2D(128, 3x3) + ReLU + MaxPooling2D(2x2)</w:t>
         <w:br/>
-        <w:t>• Blok 4: Conv2D(128 filter, 3x3) + ReLU + MaxPooling2D(2x2)</w:t>
+        <w:t>• Blok 4: Conv2D(128, 3x3) + ReLU + MaxPooling2D(2x2)</w:t>
         <w:br/>
-        <w:t>• Classifier: Flatten() -&gt; Dense(128 neuron, ReLU) -&gt; Dropout(rate) -&gt; Dense(3 neuron, Softmax)</w:t>
+        <w:t>• Classifier: Flatten() -&gt; Dense(128, ReLU) -&gt; Dropout(rate) -&gt; Dense(3, Softmax)</w:t>
       </w:r>
     </w:p>
     <w:p>
@@ -392,15 +382,13 @@
     </w:p>
     <w:p>
       <w:r>
-        <w:t>Konsep 4 skenario eksperimen dirancang secara progresif berkesinambungan:</w:t>
+        <w:t>1. Skenario 1 (Split Data): 70:15:15 vs 80:10:10 vs 90:05:05 -&gt; Split terbaik lanjut ke Skenario 2.</w:t>
         <w:br/>
-        <w:t>1. Skenario 1 (Optimasi Split Data): Menguji partisi data 70:15:15 vs 80:10:10 vs 90:05:05 pada baseline (Adam, Dropout 0.3, Tanpa Augmentasi). Hasil rasio split terbaik diwariskan ke Skenario 2.</w:t>
+        <w:t>2. Skenario 2 (Augmentasi Data): Tanpa Augmentasi vs Dengan Augmentasi -&gt; Strategi terbaik lanjut ke Skenario 3.</w:t>
         <w:br/>
-        <w:t>2. Skenario 2 (Optimasi Data Augmentasi): Menggunakan split terbaik dari Skenario 1, lalu menguji secara langsung Tanpa Augmentasi vs Dengan Augmentasi (Flip, Rotasi, Zoom). Strategi augmentasi terbaik diwariskan ke Skenario 3.</w:t>
+        <w:t>3. Skenario 3 (Optimizer): Adam vs RMSprop vs SGD Momentum -&gt; Optimizer terbaik lanjut ke Skenario 4.</w:t>
         <w:br/>
-        <w:t>3. Skenario 3 (Optimasi Optimizer): Menggunakan split terbaik dan strategi augmentasi terbaik, lalu membandingkan tiga algoritma optimasi: Adam vs RMSprop vs SGD Momentum. Optimizer terbaik diwariskan ke Skenario 4.</w:t>
-        <w:br/>
-        <w:t>4. Skenario 4 (Optimasi Regularisasi Dropout): Menggunakan konfigurasi terbaik dari Skenario 1, 2, dan 3, lalu menguji variasi nilai Dropout (0.0 vs 0.3 vs 0.5) untuk menentukan Final Champion Model.</w:t>
+        <w:t>4. Skenario 4 (Regularisasi Dropout): Dropout 0.0 vs 0.3 vs 0.5 -&gt; Menghasilkan Final Champion Model.</w:t>
       </w:r>
     </w:p>
     <w:p>
@@ -431,11 +419,6 @@
           <w:sz w:val="25"/>
         </w:rPr>
         <w:t>5.1 Ringkasan Progresi Tiap Tahap (Sequential Progression)</w:t>
-      </w:r>
-    </w:p>
-    <w:p>
-      <w:r>
-        <w:t>Tabel berikut menyajikan pemenang dari masing-masing tahap pengujian berjenjang:</w:t>
       </w:r>
     </w:p>
     <w:tbl>
@@ -527,7 +510,7 @@
                 <w:color w:val="FFFFFF"/>
                 <w:sz w:val="18"/>
               </w:rPr>
-              <w:t>Konfigurasi Pemenang</w:t>
+              <w:t>Konfigurasi Terpilih</w:t>
             </w:r>
           </w:p>
         </w:tc>
@@ -1278,11 +1261,6 @@
     </w:p>
     <w:p>
       <w:pPr>
-        <w:spacing w:after="120"/>
-      </w:pPr>
-    </w:p>
-    <w:p>
-      <w:pPr>
         <w:pStyle w:val="Heading2"/>
         <w:spacing w:before="240" w:after="80"/>
       </w:pPr>
@@ -1294,11 +1272,6 @@
           <w:sz w:val="25"/>
         </w:rPr>
         <w:t>5.2 Rekapitulasi Detail Seluruh Model yang Ditraining</w:t>
-      </w:r>
-    </w:p>
-    <w:p>
-      <w:r>
-        <w:t>Tabel berikut memuat evaluasi komparatif internal untuk seluruh 11 variasi model yang diuji di setiap skenario:</w:t>
       </w:r>
     </w:p>
     <w:tbl>
@@ -3514,11 +3487,6 @@
     </w:p>
     <w:p>
       <w:pPr>
-        <w:spacing w:after="120"/>
-      </w:pPr>
-    </w:p>
-    <w:p>
-      <w:pPr>
         <w:pStyle w:val="Heading2"/>
         <w:spacing w:before="240" w:after="80"/>
       </w:pPr>
@@ -3587,11 +3555,6 @@
     </w:p>
     <w:p>
       <w:pPr>
-        <w:spacing w:after="120"/>
-      </w:pPr>
-    </w:p>
-    <w:p>
-      <w:pPr>
         <w:pStyle w:val="Heading1"/>
         <w:spacing w:before="320" w:after="120"/>
       </w:pPr>
@@ -3607,15 +3570,15 @@
     </w:p>
     <w:p>
       <w:r>
-        <w:t>1. Pendekatan eksperimen bertingkat (Progressive Ablation Study) memberikan alur optimasi yang sistematis dan terarah dalam menemukan kombinasi hyperparameter terbaik untuk klasifikasi kanker paru-paru.</w:t>
+        <w:t>1. Pendekatan Progressive Ablation Study terbukti efektif dan sistematis dalam menemukan hyperparameter optimal.</w:t>
         <w:br/>
-        <w:t>2. Pada Tahap 1, rasio data split terbukti menjadi fondasi penting dalam menentukan kuantitas variasi citra latih yang dipelajari arsitektur CNN.</w:t>
+        <w:t>2. Rasio Split 90:05:05 memberikan kuantitas data latih terbanyak untuk representasi fitur morfologis nodul.</w:t>
         <w:br/>
-        <w:t>3. Pada Tahap 2, perbandingan langsung membuktikan bahwa citra CT-Scan murni (Tanpa Augmentasi) pada epoch pendek memberikan sinyal konvergensi yang lebih cepat dan tajam dibandingkan augmentasi rotasi sintetis.</w:t>
+        <w:t>3. Citra CT-Scan murni (Tanpa Augmentasi) pada epoch terbatas memberikan kestabilan konvergensi yang lebih tinggi.</w:t>
         <w:br/>
-        <w:t>4. Pada Tahap 3, optimizer Adam terbukti mengungguli RMSprop dan SGD Momentum dalam mengatasi lanskap loss non-konveks citra CT-Scan toraks.</w:t>
+        <w:t>4. Optimizer Adam mengungguli RMSprop dan SGD Momentum dengan adaptasi learning rate momen pertama dan kedua yang stabil.</w:t>
         <w:br/>
-        <w:t>5. Pada Tahap 4, nilai regularisasi Dropout 0.3 membuktikan perannya sebagai titik optimal dalam mencegah co-adaptasi neuron, menghasilkan Final Champion Model dengan akurasi uji 98.18%.</w:t>
+        <w:t>5. Regularisasi Dropout 0.3 berhasil memecah co-adaptasi neuron laten dan mencapai Akurasi Uji tertinggi sebesar 98.18%.</w:t>
       </w:r>
     </w:p>
     <w:p>
@@ -3678,7 +3641,7 @@
           <w:rFonts w:ascii="Calibri" w:hAnsi="Calibri"/>
           <w:sz w:val="19"/>
         </w:rPr>
-        <w:t>Srivastava, N., Hinton, G., Krizhevsky, A., Sutskever, I., &amp; Salakhutdinov, R. (2014). Dropout: A simple way to prevent neural networks from overfitting. JMLR, 15(1), 1929-1958.</w:t>
+        <w:t>Srivastava, N., et al. (2014). Dropout: A simple way to prevent neural networks from overfitting. JMLR, 15(1), 1929-1958.</w:t>
       </w:r>
     </w:p>
     <w:p>

</xml_diff>

<commit_message>
Update: Mengurutkan daftar anggota Kelompok 6 secara ascending berdasarkan NIM
</commit_message>
<xml_diff>
--- a/Laporan_Lengkap_UTS_DeepLearning_CNN.docx
+++ b/Laporan_Lengkap_UTS_DeepLearning_CNN.docx
@@ -160,11 +160,11 @@
             <w:r>
               <w:t>: 1. Attala Alif Ramadhani Tri Hida (230441100144)</w:t>
               <w:br/>
-              <w:t xml:space="preserve">  2. Nafaul Hernanda Romadlona (240441100125)</w:t>
+              <w:t xml:space="preserve">  2. Naufal Husain (240441100038)</w:t>
               <w:br/>
               <w:t xml:space="preserve">  3. M.Rafly Kurniawan (240441100086)</w:t>
               <w:br/>
-              <w:t xml:space="preserve">  4. Naufal Husain (240441100038)</w:t>
+              <w:t xml:space="preserve">  4. Nafaul Hernanda Romadlona (240441100125)</w:t>
             </w:r>
           </w:p>
         </w:tc>

</xml_diff>